<commit_message>
Apple subscriptions document: the sourcing and approval rules up front
Co-Authored-By: Claude Fable 5.1 <noreply@anthropic.com>
Claude-Session: https://claude.ai/code/session_01FdLL4Wp3bi12KNX6zHRo7N
</commit_message>
<xml_diff>
--- a/EZvoxa Subscriptions Direct with Apple.docx
+++ b/EZvoxa Subscriptions Direct with Apple.docx
@@ -51,6 +51,98 @@
           <w:szCs w:val="20"/>
         </w:rPr>
         <w:t xml:space="preserve">Prepared for Frank Schaeffer, EZ Voice LLC. Every fact about Apple in this document was read from Apple’s own documentation on 5 September 2026. Where something has not been checked, it says so.</w:t>
+      </w:r>
+    </w:p>
+    <w:p>
+      <w:pPr>
+        <w:pStyle w:val="Heading1"/>
+        <w:spacing w:after="120" w:before="320"/>
+      </w:pPr>
+      <w:r>
+        <w:rPr>
+          <w:rFonts w:ascii="Calibri" w:cs="Calibri" w:eastAsia="Calibri" w:hAnsi="Calibri"/>
+        </w:rPr>
+        <w:t xml:space="preserve">How the facts in this document were gathered</w:t>
+      </w:r>
+    </w:p>
+    <w:p>
+      <w:pPr>
+        <w:spacing w:after="120"/>
+      </w:pPr>
+      <w:r>
+        <w:rPr>
+          <w:rFonts w:ascii="Calibri" w:cs="Calibri" w:eastAsia="Calibri" w:hAnsi="Calibri"/>
+          <w:sz w:val="22"/>
+          <w:szCs w:val="22"/>
+        </w:rPr>
+        <w:t xml:space="preserve">Two rules, set by Frank, apply to every line here and to everything that follows in this process.</w:t>
+      </w:r>
+    </w:p>
+    <w:p>
+      <w:pPr>
+        <w:pStyle w:val="ListParagraph"/>
+        <w:numPr>
+          <w:ilvl w:val="0"/>
+          <w:numId w:val="2"/>
+        </w:numPr>
+        <w:spacing w:after="80"/>
+      </w:pPr>
+      <w:r>
+        <w:rPr>
+          <w:rFonts w:ascii="Calibri" w:cs="Calibri" w:eastAsia="Calibri" w:hAnsi="Calibri"/>
+          <w:sz w:val="22"/>
+          <w:szCs w:val="22"/>
+        </w:rPr>
+        <w:t xml:space="preserve">No guessing. No assuming. Anything not checked is marked as not checked.</w:t>
+      </w:r>
+    </w:p>
+    <w:p>
+      <w:pPr>
+        <w:pStyle w:val="ListParagraph"/>
+        <w:numPr>
+          <w:ilvl w:val="0"/>
+          <w:numId w:val="2"/>
+        </w:numPr>
+        <w:spacing w:after="80"/>
+      </w:pPr>
+      <w:r>
+        <w:rPr>
+          <w:rFonts w:ascii="Calibri" w:cs="Calibri" w:eastAsia="Calibri" w:hAnsi="Calibri"/>
+          <w:sz w:val="22"/>
+          <w:szCs w:val="22"/>
+        </w:rPr>
+        <w:t xml:space="preserve">Information comes only from a legitimate source: the company’s own documentation, or a government body. No forums, no blogs, no chats. The one exception is a support chat that is specifically from the entity being researched, such as Apple Support or Google Support, which counts as that entity speaking. A community thread on that entity’s own site does not.</w:t>
+      </w:r>
+    </w:p>
+    <w:p>
+      <w:pPr>
+        <w:pStyle w:val="ListParagraph"/>
+        <w:numPr>
+          <w:ilvl w:val="0"/>
+          <w:numId w:val="2"/>
+        </w:numPr>
+        <w:spacing w:after="80"/>
+      </w:pPr>
+      <w:r>
+        <w:rPr>
+          <w:rFonts w:ascii="Calibri" w:cs="Calibri" w:eastAsia="Calibri" w:hAnsi="Calibri"/>
+          <w:sz w:val="22"/>
+          <w:szCs w:val="22"/>
+        </w:rPr>
+        <w:t xml:space="preserve">No build is executed without Frank’s approval.</w:t>
+      </w:r>
+    </w:p>
+    <w:p>
+      <w:pPr>
+        <w:spacing w:after="120"/>
+      </w:pPr>
+      <w:r>
+        <w:rPr>
+          <w:rFonts w:ascii="Calibri" w:cs="Calibri" w:eastAsia="Calibri" w:hAnsi="Calibri"/>
+          <w:sz w:val="22"/>
+          <w:szCs w:val="22"/>
+        </w:rPr>
+        <w:t xml:space="preserve">Every Apple fact in this document was read from developer.apple.com on 5 September 2026. Two Apple sites could not be opened from my machine, apple.com (where the root certificate lives) and help.apple.com, so the steps that depend on them are marked as yours to do.</w:t>
       </w:r>
     </w:p>
     <w:p>

</xml_diff>

<commit_message>
Rule: directions for blocked sites carry a link or search words and step-by-step actions; applied to the Apple document and the Twilio step
Co-Authored-By: Claude Fable 5.1 <noreply@anthropic.com>
Claude-Session: https://claude.ai/code/session_01FdLL4Wp3bi12KNX6zHRo7N
</commit_message>
<xml_diff>
--- a/EZvoxa Subscriptions Direct with Apple.docx
+++ b/EZvoxa Subscriptions Direct with Apple.docx
@@ -679,7 +679,7 @@
           <w:sz w:val="22"/>
           <w:szCs w:val="22"/>
         </w:rPr>
-        <w:t xml:space="preserve">Go to https://www.apple.com/certificateauthority/ and download Apple Root CA - G3. This site is blocked from my machine, so this step is yours. On a Mac, turn the file into text with the command: base64 -i AppleRootCA-G3.cer</w:t>
+        <w:t xml:space="preserve">This site is blocked from my machine, so I cannot see the page and the steps below describe what Apple’s developer documentation says is there, not the screen itself. Link: https://www.apple.com/certificateauthority/ (if the link does not open, search: Apple PKI root certificates). Steps: 1. Open the link on a Mac. 2. Find the section headed Apple Root Certificates. 3. Download every certificate listed in that section; they arrive as .cer files. 4. Open the Terminal app. 5. For each file, type base64 -i followed by a space and the file’s path (drag the file into the Terminal window to fill in the path), then press Return. 6. Copy the block of text it prints. 7. Paste it into Vercel as APPLE_ROOT_CERTS in step 5; if there is more than one certificate, paste them one after another separated by a comma. If the page looks different from this, paste me what it shows and I will adjust the steps.</w:t>
       </w:r>
     </w:p>
     <w:p>
@@ -707,7 +707,7 @@
           <w:sz w:val="22"/>
           <w:szCs w:val="22"/>
         </w:rPr>
-        <w:t xml:space="preserve">Project, Settings, Environment Variables. The table in section 5 lists them. Then Redeploy.</w:t>
+        <w:t xml:space="preserve">Link: https://vercel.com/dashboard. Steps: 1. Sign in. 2. Open the ez-comm-tether project. 3. Open Settings, then Environment Variables. 4. For each row in the table in section 5, type the name, paste the value, and save. 5. Open Deployments, open the menu on the newest deployment, and choose Redeploy. 6. Open https://ez-comm-tether.vercel.app/api/plan in a browser; it should show roots: 1, appId: true, apiKey: true.</w:t>
       </w:r>
     </w:p>
     <w:p>

</xml_diff>